<commit_message>
ubdate db schema and documentation
</commit_message>
<xml_diff>
--- a/Lesson 2.docx
+++ b/Lesson 2.docx
@@ -81,6 +81,78 @@
         </w:rPr>
         <w:t>.</w:t>
       </w:r>
+      <w:r>
+        <w:rPr>
+          <w:color w:val="000000" w:themeColor="text1"/>
+        </w:rPr>
+        <w:t xml:space="preserve"> </w:t>
+      </w:r>
+      <w:r>
+        <w:rPr>
+          <w:color w:val="000000" w:themeColor="text1"/>
+          <w:lang w:val="ru-RU"/>
+        </w:rPr>
+        <w:t>БД исключает дублирование мероприятий. Позволяет: контролировать заполняемость конкретной площадки; позволяет посетителю зарегистрироваться на интересующее его мероприятие;</w:t>
+      </w:r>
+      <w:r>
+        <w:rPr>
+          <w:color w:val="000000" w:themeColor="text1"/>
+          <w:lang w:val="ru-RU"/>
+        </w:rPr>
+        <w:t xml:space="preserve"> отслеживать </w:t>
+      </w:r>
+      <w:r>
+        <w:rPr>
+          <w:color w:val="000000" w:themeColor="text1"/>
+        </w:rPr>
+        <w:t>динамики продаж по времени</w:t>
+      </w:r>
+      <w:r>
+        <w:rPr>
+          <w:color w:val="000000" w:themeColor="text1"/>
+          <w:lang w:val="ru-RU"/>
+        </w:rPr>
+        <w:t>;</w:t>
+      </w:r>
+      <w:r>
+        <w:rPr>
+          <w:color w:val="000000" w:themeColor="text1"/>
+        </w:rPr>
+        <w:t xml:space="preserve"> рас</w:t>
+      </w:r>
+      <w:r>
+        <w:rPr>
+          <w:color w:val="000000" w:themeColor="text1"/>
+          <w:lang w:val="ru-RU"/>
+        </w:rPr>
+        <w:t>с</w:t>
+      </w:r>
+      <w:r>
+        <w:rPr>
+          <w:color w:val="000000" w:themeColor="text1"/>
+        </w:rPr>
+        <w:t>ч</w:t>
+      </w:r>
+      <w:r>
+        <w:rPr>
+          <w:color w:val="000000" w:themeColor="text1"/>
+          <w:lang w:val="ru-RU"/>
+        </w:rPr>
+        <w:t xml:space="preserve">итывать </w:t>
+      </w:r>
+      <w:r>
+        <w:rPr>
+          <w:color w:val="000000" w:themeColor="text1"/>
+        </w:rPr>
+        <w:t>выручк</w:t>
+      </w:r>
+      <w:r>
+        <w:rPr>
+          <w:color w:val="000000" w:themeColor="text1"/>
+          <w:lang w:val="ru-RU"/>
+        </w:rPr>
+        <w:t>у каждого мероприятия и тд.</w:t>
+      </w:r>
     </w:p>
     <w:p>
       <w:pPr>
@@ -340,7 +412,21 @@
           <w:color w:val="000000" w:themeColor="text1"/>
           <w:lang w:val="en-US"/>
         </w:rPr>
-        <w:t>Area_id: INTEGER, PRIMARY KEY, AUTO_INCREMENT</w:t>
+        <w:t xml:space="preserve">Area_id: </w:t>
+      </w:r>
+      <w:r>
+        <w:rPr>
+          <w:color w:val="000000" w:themeColor="text1"/>
+          <w:lang w:val="en-US"/>
+        </w:rPr>
+        <w:t>SERIAL</w:t>
+      </w:r>
+      <w:r>
+        <w:rPr>
+          <w:color w:val="000000" w:themeColor="text1"/>
+          <w:lang w:val="en-US"/>
+        </w:rPr>
+        <w:t>, PRIMARY KEY</w:t>
       </w:r>
     </w:p>
     <w:p>
@@ -395,6 +481,13 @@
           <w:color w:val="000000" w:themeColor="text1"/>
           <w:lang w:val="en-US"/>
         </w:rPr>
+        <w:t>,</w:t>
+      </w:r>
+      <w:r>
+        <w:rPr>
+          <w:color w:val="000000" w:themeColor="text1"/>
+          <w:lang w:val="en-US"/>
+        </w:rPr>
         <w:t xml:space="preserve"> UNIQUE</w:t>
       </w:r>
     </w:p>
@@ -417,6 +510,13 @@
         </w:rPr>
         <w:t>Area_name: VARCHAR (150)</w:t>
       </w:r>
+      <w:r>
+        <w:rPr>
+          <w:color w:val="000000" w:themeColor="text1"/>
+          <w:lang w:val="en-US"/>
+        </w:rPr>
+        <w:t>, NOT NULL</w:t>
+      </w:r>
     </w:p>
     <w:p>
       <w:pPr>
@@ -674,7 +774,21 @@
           <w:color w:val="000000" w:themeColor="text1"/>
           <w:lang w:val="en-US"/>
         </w:rPr>
-        <w:t>Event_id: INTEGER, PRIMARY KEY, AUTO_INCREMENT</w:t>
+        <w:t xml:space="preserve">Event_id: </w:t>
+      </w:r>
+      <w:r>
+        <w:rPr>
+          <w:color w:val="000000" w:themeColor="text1"/>
+          <w:lang w:val="en-US"/>
+        </w:rPr>
+        <w:t>SERIAL</w:t>
+      </w:r>
+      <w:r>
+        <w:rPr>
+          <w:color w:val="000000" w:themeColor="text1"/>
+          <w:lang w:val="en-US"/>
+        </w:rPr>
+        <w:t>, PRIMARY KEY</w:t>
       </w:r>
     </w:p>
     <w:p>
@@ -762,7 +876,27 @@
           <w:color w:val="000000" w:themeColor="text1"/>
           <w:lang w:val="en-US"/>
         </w:rPr>
-        <w:t>DECIMAL (10, 2), DEFAULT 0</w:t>
+        <w:t xml:space="preserve">DECIMAL (10, 2), </w:t>
+      </w:r>
+      <w:r>
+        <w:rPr>
+          <w:color w:val="000000" w:themeColor="text1"/>
+          <w:lang w:val="en-US"/>
+        </w:rPr>
+        <w:t xml:space="preserve">NOT NULL, </w:t>
+      </w:r>
+      <w:r>
+        <w:rPr>
+          <w:color w:val="000000" w:themeColor="text1"/>
+          <w:lang w:val="en-US"/>
+        </w:rPr>
+        <w:t xml:space="preserve">CHECK </w:t>
+      </w:r>
+      <w:r>
+        <w:rPr>
+          <w:color w:val="000000" w:themeColor="text1"/>
+        </w:rPr>
+        <w:t>(Price &gt;= 0)</w:t>
       </w:r>
     </w:p>
     <w:p>
@@ -774,22 +908,22 @@
         </w:numPr>
         <w:rPr>
           <w:color w:val="000000" w:themeColor="text1"/>
-          <w:lang w:val="ru-RU"/>
-        </w:rPr>
-      </w:pPr>
-      <w:r>
-        <w:rPr>
-          <w:color w:val="000000" w:themeColor="text1"/>
-          <w:lang w:val="en-US"/>
-        </w:rPr>
-        <w:t>Event_date: DATE</w:t>
-      </w:r>
-      <w:r>
-        <w:rPr>
-          <w:color w:val="000000" w:themeColor="text1"/>
-          <w:lang w:val="en-US"/>
-        </w:rPr>
-        <w:t>TIME</w:t>
+          <w:lang w:val="en-US"/>
+        </w:rPr>
+      </w:pPr>
+      <w:r>
+        <w:rPr>
+          <w:color w:val="000000" w:themeColor="text1"/>
+          <w:lang w:val="en-US"/>
+        </w:rPr>
+        <w:t xml:space="preserve">Event_date: </w:t>
+      </w:r>
+      <w:r>
+        <w:rPr>
+          <w:color w:val="000000" w:themeColor="text1"/>
+          <w:lang w:val="en-US"/>
+        </w:rPr>
+        <w:t>TIMESTAMP</w:t>
       </w:r>
       <w:r>
         <w:rPr>
@@ -982,6 +1116,37 @@
     <w:p>
       <w:pPr>
         <w:pStyle w:val="a7"/>
+        <w:numPr>
+          <w:ilvl w:val="0"/>
+          <w:numId w:val="13"/>
+        </w:numPr>
+        <w:rPr>
+          <w:color w:val="000000" w:themeColor="text1"/>
+          <w:lang w:val="en-US"/>
+        </w:rPr>
+      </w:pPr>
+      <w:r>
+        <w:rPr>
+          <w:color w:val="000000" w:themeColor="text1"/>
+        </w:rPr>
+        <w:t>CHK_Event_Price</w:t>
+      </w:r>
+      <w:r>
+        <w:rPr>
+          <w:color w:val="000000" w:themeColor="text1"/>
+        </w:rPr>
+        <w:t>:</w:t>
+      </w:r>
+      <w:r>
+        <w:rPr>
+          <w:color w:val="000000" w:themeColor="text1"/>
+        </w:rPr>
+        <w:t xml:space="preserve"> CHECK (Price &gt;= 0)</w:t>
+      </w:r>
+    </w:p>
+    <w:p>
+      <w:pPr>
+        <w:pStyle w:val="a7"/>
         <w:ind w:left="1440"/>
         <w:rPr>
           <w:color w:val="000000" w:themeColor="text1"/>
@@ -1075,7 +1240,21 @@
           <w:color w:val="000000" w:themeColor="text1"/>
           <w:lang w:val="en-US"/>
         </w:rPr>
-        <w:t>Visitor_id:  INTEGER, PRIMARY KEY, AUTO_INCREMENT</w:t>
+        <w:t xml:space="preserve">Visitor_id: </w:t>
+      </w:r>
+      <w:r>
+        <w:rPr>
+          <w:color w:val="000000" w:themeColor="text1"/>
+          <w:lang w:val="en-US"/>
+        </w:rPr>
+        <w:t>SERIAL</w:t>
+      </w:r>
+      <w:r>
+        <w:rPr>
+          <w:color w:val="000000" w:themeColor="text1"/>
+          <w:lang w:val="en-US"/>
+        </w:rPr>
+        <w:t>, PRIMARY KEY</w:t>
       </w:r>
     </w:p>
     <w:p>
@@ -1095,6 +1274,7 @@
           <w:color w:val="000000" w:themeColor="text1"/>
           <w:lang w:val="en-US"/>
         </w:rPr>
+        <w:lastRenderedPageBreak/>
         <w:t>N</w:t>
       </w:r>
       <w:r>
@@ -1109,7 +1289,28 @@
           <w:color w:val="000000" w:themeColor="text1"/>
           <w:lang w:val="en-US"/>
         </w:rPr>
-        <w:t>VARCHAR (20)</w:t>
+        <w:t>VARCHAR (</w:t>
+      </w:r>
+      <w:r>
+        <w:rPr>
+          <w:color w:val="000000" w:themeColor="text1"/>
+          <w:lang w:val="en-US"/>
+        </w:rPr>
+        <w:t>5</w:t>
+      </w:r>
+      <w:r>
+        <w:rPr>
+          <w:color w:val="000000" w:themeColor="text1"/>
+          <w:lang w:val="en-US"/>
+        </w:rPr>
+        <w:t>0)</w:t>
+      </w:r>
+      <w:r>
+        <w:rPr>
+          <w:color w:val="000000" w:themeColor="text1"/>
+          <w:lang w:val="en-US"/>
+        </w:rPr>
+        <w:t>, NOT NULL</w:t>
       </w:r>
     </w:p>
     <w:p>
@@ -1129,7 +1330,28 @@
           <w:color w:val="000000" w:themeColor="text1"/>
           <w:lang w:val="en-US"/>
         </w:rPr>
-        <w:t>Surname: VARCHAR (20)</w:t>
+        <w:t>Surname: VARCHAR (</w:t>
+      </w:r>
+      <w:r>
+        <w:rPr>
+          <w:color w:val="000000" w:themeColor="text1"/>
+          <w:lang w:val="ru-RU"/>
+        </w:rPr>
+        <w:t>5</w:t>
+      </w:r>
+      <w:r>
+        <w:rPr>
+          <w:color w:val="000000" w:themeColor="text1"/>
+          <w:lang w:val="en-US"/>
+        </w:rPr>
+        <w:t>0)</w:t>
+      </w:r>
+      <w:r>
+        <w:rPr>
+          <w:color w:val="000000" w:themeColor="text1"/>
+          <w:lang w:val="en-US"/>
+        </w:rPr>
+        <w:t>, NOT NULL</w:t>
       </w:r>
     </w:p>
     <w:p>
@@ -1208,7 +1430,6 @@
           <w:color w:val="000000" w:themeColor="text1"/>
           <w:lang w:val="en-US"/>
         </w:rPr>
-        <w:lastRenderedPageBreak/>
         <w:t>PK_Visitor: PRIMARY KEY (Visitor_id)</w:t>
       </w:r>
     </w:p>
@@ -1337,7 +1558,28 @@
           <w:color w:val="000000" w:themeColor="text1"/>
           <w:lang w:val="en-US"/>
         </w:rPr>
-        <w:t>Ticket_id: INTEGER, PRIMARY KEY, AUTO_INCREMENT</w:t>
+        <w:t>Ticket_id:</w:t>
+      </w:r>
+      <w:r>
+        <w:rPr>
+          <w:color w:val="000000" w:themeColor="text1"/>
+          <w:lang w:val="en-US"/>
+        </w:rPr>
+        <w:t xml:space="preserve"> </w:t>
+      </w:r>
+      <w:r>
+        <w:rPr>
+          <w:color w:val="000000" w:themeColor="text1"/>
+          <w:lang w:val="en-US"/>
+        </w:rPr>
+        <w:t>SERIAL</w:t>
+      </w:r>
+      <w:r>
+        <w:rPr>
+          <w:color w:val="000000" w:themeColor="text1"/>
+          <w:lang w:val="en-US"/>
+        </w:rPr>
+        <w:t>, PRIMARY KEY</w:t>
       </w:r>
     </w:p>
     <w:p>
@@ -1382,6 +1624,308 @@
     </w:p>
     <w:p>
       <w:pPr>
+        <w:pStyle w:val="a7"/>
+        <w:numPr>
+          <w:ilvl w:val="0"/>
+          <w:numId w:val="9"/>
+        </w:numPr>
+        <w:rPr>
+          <w:color w:val="000000" w:themeColor="text1"/>
+          <w:lang w:val="en-US"/>
+        </w:rPr>
+      </w:pPr>
+      <w:r>
+        <w:rPr>
+          <w:color w:val="000000" w:themeColor="text1"/>
+        </w:rPr>
+        <w:t>P</w:t>
+      </w:r>
+      <w:r>
+        <w:rPr>
+          <w:color w:val="000000" w:themeColor="text1"/>
+        </w:rPr>
+        <w:t>urchase_date</w:t>
+      </w:r>
+      <w:r>
+        <w:rPr>
+          <w:color w:val="000000" w:themeColor="text1"/>
+        </w:rPr>
+        <w:t xml:space="preserve">: </w:t>
+      </w:r>
+      <w:r>
+        <w:rPr>
+          <w:color w:val="000000" w:themeColor="text1"/>
+        </w:rPr>
+        <w:t>TIMESTAMP</w:t>
+      </w:r>
+      <w:r>
+        <w:rPr>
+          <w:color w:val="000000" w:themeColor="text1"/>
+        </w:rPr>
+        <w:t>,</w:t>
+      </w:r>
+      <w:r>
+        <w:rPr>
+          <w:color w:val="000000" w:themeColor="text1"/>
+        </w:rPr>
+        <w:t xml:space="preserve"> NOT NULL</w:t>
+      </w:r>
+      <w:r>
+        <w:rPr>
+          <w:color w:val="000000" w:themeColor="text1"/>
+        </w:rPr>
+        <w:t>,</w:t>
+      </w:r>
+      <w:r>
+        <w:rPr>
+          <w:color w:val="000000" w:themeColor="text1"/>
+        </w:rPr>
+        <w:t xml:space="preserve"> DEFAULT CURRENT_TIMESTAMP</w:t>
+      </w:r>
+    </w:p>
+    <w:p>
+      <w:pPr>
+        <w:pStyle w:val="a7"/>
+        <w:numPr>
+          <w:ilvl w:val="0"/>
+          <w:numId w:val="9"/>
+        </w:numPr>
+        <w:rPr>
+          <w:color w:val="000000" w:themeColor="text1"/>
+          <w:lang w:val="en-US"/>
+        </w:rPr>
+      </w:pPr>
+      <w:r>
+        <w:rPr>
+          <w:color w:val="000000" w:themeColor="text1"/>
+        </w:rPr>
+        <w:t xml:space="preserve">Purchase_price: </w:t>
+      </w:r>
+      <w:r>
+        <w:rPr>
+          <w:color w:val="000000" w:themeColor="text1"/>
+          <w:lang w:val="en-US"/>
+        </w:rPr>
+        <w:t>DECIMAL</w:t>
+      </w:r>
+      <w:r>
+        <w:rPr>
+          <w:color w:val="000000" w:themeColor="text1"/>
+          <w:lang w:val="en-US"/>
+        </w:rPr>
+        <w:t xml:space="preserve"> (10, 2), </w:t>
+      </w:r>
+      <w:r>
+        <w:rPr>
+          <w:color w:val="000000" w:themeColor="text1"/>
+          <w:lang w:val="en-US"/>
+        </w:rPr>
+        <w:t>NOT</w:t>
+      </w:r>
+      <w:r>
+        <w:rPr>
+          <w:color w:val="000000" w:themeColor="text1"/>
+          <w:lang w:val="en-US"/>
+        </w:rPr>
+        <w:t xml:space="preserve"> </w:t>
+      </w:r>
+      <w:r>
+        <w:rPr>
+          <w:color w:val="000000" w:themeColor="text1"/>
+          <w:lang w:val="en-US"/>
+        </w:rPr>
+        <w:t>NULL</w:t>
+      </w:r>
+      <w:r>
+        <w:rPr>
+          <w:color w:val="000000" w:themeColor="text1"/>
+          <w:lang w:val="en-US"/>
+        </w:rPr>
+        <w:t xml:space="preserve">, </w:t>
+      </w:r>
+      <w:r>
+        <w:rPr>
+          <w:color w:val="000000" w:themeColor="text1"/>
+          <w:lang w:val="en-US"/>
+        </w:rPr>
+        <w:t>CHECK</w:t>
+      </w:r>
+      <w:r>
+        <w:rPr>
+          <w:color w:val="000000" w:themeColor="text1"/>
+          <w:lang w:val="en-US"/>
+        </w:rPr>
+        <w:t xml:space="preserve"> </w:t>
+      </w:r>
+      <w:r>
+        <w:rPr>
+          <w:color w:val="000000" w:themeColor="text1"/>
+        </w:rPr>
+        <w:t>(</w:t>
+      </w:r>
+      <w:r>
+        <w:rPr>
+          <w:color w:val="000000" w:themeColor="text1"/>
+          <w:lang w:val="en-US"/>
+        </w:rPr>
+        <w:t>Purchase_p</w:t>
+      </w:r>
+      <w:r>
+        <w:rPr>
+          <w:color w:val="000000" w:themeColor="text1"/>
+        </w:rPr>
+        <w:t>rice &gt;= 0)</w:t>
+      </w:r>
+      <w:r>
+        <w:rPr>
+          <w:color w:val="000000" w:themeColor="text1"/>
+          <w:lang w:val="en-US"/>
+        </w:rPr>
+        <w:t xml:space="preserve"> (</w:t>
+      </w:r>
+      <w:r>
+        <w:rPr>
+          <w:color w:val="000000" w:themeColor="text1"/>
+          <w:lang w:val="ru-RU"/>
+        </w:rPr>
+        <w:t>Чтобы</w:t>
+      </w:r>
+      <w:r>
+        <w:rPr>
+          <w:color w:val="000000" w:themeColor="text1"/>
+          <w:lang w:val="en-US"/>
+        </w:rPr>
+        <w:t xml:space="preserve"> </w:t>
+      </w:r>
+      <w:r>
+        <w:rPr>
+          <w:color w:val="000000" w:themeColor="text1"/>
+          <w:lang w:val="ru-RU"/>
+        </w:rPr>
+        <w:t>зафиксировать</w:t>
+      </w:r>
+      <w:r>
+        <w:rPr>
+          <w:color w:val="000000" w:themeColor="text1"/>
+          <w:lang w:val="en-US"/>
+        </w:rPr>
+        <w:t xml:space="preserve"> </w:t>
+      </w:r>
+      <w:r>
+        <w:rPr>
+          <w:color w:val="000000" w:themeColor="text1"/>
+          <w:lang w:val="ru-RU"/>
+        </w:rPr>
+        <w:t>цену</w:t>
+      </w:r>
+      <w:r>
+        <w:rPr>
+          <w:color w:val="000000" w:themeColor="text1"/>
+          <w:lang w:val="en-US"/>
+        </w:rPr>
+        <w:t xml:space="preserve"> </w:t>
+      </w:r>
+      <w:r>
+        <w:rPr>
+          <w:color w:val="000000" w:themeColor="text1"/>
+          <w:lang w:val="ru-RU"/>
+        </w:rPr>
+        <w:t>в</w:t>
+      </w:r>
+      <w:r>
+        <w:rPr>
+          <w:color w:val="000000" w:themeColor="text1"/>
+          <w:lang w:val="en-US"/>
+        </w:rPr>
+        <w:t xml:space="preserve"> </w:t>
+      </w:r>
+      <w:r>
+        <w:rPr>
+          <w:color w:val="000000" w:themeColor="text1"/>
+          <w:lang w:val="ru-RU"/>
+        </w:rPr>
+        <w:t>момент</w:t>
+      </w:r>
+      <w:r>
+        <w:rPr>
+          <w:color w:val="000000" w:themeColor="text1"/>
+          <w:lang w:val="en-US"/>
+        </w:rPr>
+        <w:t xml:space="preserve"> </w:t>
+      </w:r>
+      <w:r>
+        <w:rPr>
+          <w:color w:val="000000" w:themeColor="text1"/>
+          <w:lang w:val="ru-RU"/>
+        </w:rPr>
+        <w:t>приобретения</w:t>
+      </w:r>
+      <w:r>
+        <w:rPr>
+          <w:color w:val="000000" w:themeColor="text1"/>
+          <w:lang w:val="en-US"/>
+        </w:rPr>
+        <w:t xml:space="preserve"> </w:t>
+      </w:r>
+      <w:r>
+        <w:rPr>
+          <w:color w:val="000000" w:themeColor="text1"/>
+          <w:lang w:val="ru-RU"/>
+        </w:rPr>
+        <w:t>билета</w:t>
+      </w:r>
+      <w:r>
+        <w:rPr>
+          <w:color w:val="000000" w:themeColor="text1"/>
+          <w:lang w:val="en-US"/>
+        </w:rPr>
+        <w:t xml:space="preserve"> </w:t>
+      </w:r>
+      <w:r>
+        <w:rPr>
+          <w:color w:val="000000" w:themeColor="text1"/>
+          <w:lang w:val="ru-RU"/>
+        </w:rPr>
+        <w:t>из</w:t>
+      </w:r>
+      <w:r>
+        <w:rPr>
+          <w:color w:val="000000" w:themeColor="text1"/>
+          <w:lang w:val="en-US"/>
+        </w:rPr>
+        <w:t xml:space="preserve"> </w:t>
+      </w:r>
+      <w:r>
+        <w:rPr>
+          <w:color w:val="000000" w:themeColor="text1"/>
+          <w:lang w:val="ru-RU"/>
+        </w:rPr>
+        <w:t>таблицы</w:t>
+      </w:r>
+      <w:r>
+        <w:rPr>
+          <w:color w:val="000000" w:themeColor="text1"/>
+          <w:lang w:val="en-US"/>
+        </w:rPr>
+        <w:t xml:space="preserve"> </w:t>
+      </w:r>
+      <w:r>
+        <w:rPr>
+          <w:color w:val="000000" w:themeColor="text1"/>
+          <w:lang w:val="en-US"/>
+        </w:rPr>
+        <w:t>Event</w:t>
+      </w:r>
+      <w:r>
+        <w:rPr>
+          <w:color w:val="000000" w:themeColor="text1"/>
+          <w:lang w:val="en-US"/>
+        </w:rPr>
+        <w:t>)</w:t>
+      </w:r>
+    </w:p>
+    <w:p>
+      <w:pPr>
         <w:ind w:firstLine="720"/>
         <w:rPr>
           <w:color w:val="000000" w:themeColor="text1"/>
@@ -1465,6 +2009,67 @@
     <w:p>
       <w:pPr>
         <w:pStyle w:val="a7"/>
+        <w:numPr>
+          <w:ilvl w:val="0"/>
+          <w:numId w:val="13"/>
+        </w:numPr>
+        <w:rPr>
+          <w:color w:val="000000" w:themeColor="text1"/>
+          <w:lang w:val="en-US"/>
+        </w:rPr>
+      </w:pPr>
+      <w:r>
+        <w:rPr>
+          <w:color w:val="000000" w:themeColor="text1"/>
+        </w:rPr>
+        <w:t>CHK_</w:t>
+      </w:r>
+      <w:r>
+        <w:rPr>
+          <w:color w:val="000000" w:themeColor="text1"/>
+        </w:rPr>
+        <w:t xml:space="preserve"> </w:t>
+      </w:r>
+      <w:r>
+        <w:rPr>
+          <w:color w:val="000000" w:themeColor="text1"/>
+        </w:rPr>
+        <w:t>Purchase</w:t>
+      </w:r>
+      <w:r>
+        <w:rPr>
+          <w:color w:val="000000" w:themeColor="text1"/>
+        </w:rPr>
+        <w:t>_Price</w:t>
+      </w:r>
+      <w:r>
+        <w:rPr>
+          <w:color w:val="000000" w:themeColor="text1"/>
+        </w:rPr>
+        <w:t>:</w:t>
+      </w:r>
+      <w:r>
+        <w:rPr>
+          <w:color w:val="000000" w:themeColor="text1"/>
+        </w:rPr>
+        <w:t xml:space="preserve"> CHECK (</w:t>
+      </w:r>
+      <w:r>
+        <w:rPr>
+          <w:color w:val="000000" w:themeColor="text1"/>
+        </w:rPr>
+        <w:t>Purchase_price</w:t>
+      </w:r>
+      <w:r>
+        <w:rPr>
+          <w:color w:val="000000" w:themeColor="text1"/>
+        </w:rPr>
+        <w:t xml:space="preserve"> &gt;= 0)</w:t>
+      </w:r>
+    </w:p>
+    <w:p>
+      <w:pPr>
+        <w:pStyle w:val="a7"/>
         <w:ind w:left="1440"/>
         <w:rPr>
           <w:color w:val="000000" w:themeColor="text1"/>
@@ -1950,9 +2555,9 @@
         <w:rPr>
           <w:rStyle w:val="ac"/>
           <w:color w:val="000000" w:themeColor="text1"/>
-          <w:lang w:val="ru-RU"/>
-        </w:rPr>
-        <w:t>2</w:t>
+          <w:lang w:val="en-US"/>
+        </w:rPr>
+        <w:t>3</w:t>
       </w:r>
       <w:r>
         <w:rPr>
@@ -1982,9 +2587,9 @@
           <w:noProof/>
         </w:rPr>
         <w:drawing>
-          <wp:inline distT="0" distB="0" distL="0" distR="0" wp14:anchorId="11936804" wp14:editId="7FBB174F">
-            <wp:extent cx="5596083" cy="3963670"/>
-            <wp:effectExtent l="0" t="0" r="5080" b="0"/>
+          <wp:inline distT="0" distB="0" distL="0" distR="0" wp14:anchorId="35E10CEB" wp14:editId="71707CCF">
+            <wp:extent cx="6645910" cy="2287270"/>
+            <wp:effectExtent l="0" t="0" r="2540" b="0"/>
             <wp:docPr id="1" name="Рисунок 1"/>
             <wp:cNvGraphicFramePr>
               <a:graphicFrameLocks xmlns:a="http://schemas.openxmlformats.org/drawingml/2006/main" noChangeAspect="1"/>
@@ -2005,7 +2610,7 @@
                   <pic:spPr>
                     <a:xfrm>
                       <a:off x="0" y="0"/>
-                      <a:ext cx="5603018" cy="3968582"/>
+                      <a:ext cx="6645910" cy="2287270"/>
                     </a:xfrm>
                     <a:prstGeom prst="rect">
                       <a:avLst/>
@@ -2016,12 +2621,6 @@
             </a:graphic>
           </wp:inline>
         </w:drawing>
-      </w:r>
-      <w:r>
-        <w:rPr>
-          <w:lang w:val="ru-RU"/>
-        </w:rPr>
-        <w:t xml:space="preserve"> </w:t>
       </w:r>
     </w:p>
     <w:sectPr>
@@ -4036,7 +4635,6 @@
   <w:style w:type="character" w:default="1" w:styleId="a0">
     <w:name w:val="Default Paragraph Font"/>
     <w:uiPriority w:val="1"/>
-    <w:semiHidden/>
     <w:unhideWhenUsed/>
   </w:style>
   <w:style w:type="table" w:default="1" w:styleId="a1">

</xml_diff>